<commit_message>
SOW v2: remove CMU resource mentions; client provides sandbox and credits
</commit_message>
<xml_diff>
--- a/docs/Scope of Work v2.docx
+++ b/docs/Scope of Work v2.docx
@@ -2437,7 +2437,7 @@
           <w:color w:val="FF0000"/>
           <w:rtl w:val="0"/>
         </w:rPr>
-        <w:t xml:space="preserve">Cloud model API usage and sandbox compute costs will be covered as follows [to be confirmed with the Client before signing]: the Client will provide cloud model API credits up to $[X] and the sandbox compute described above. If either is unavailable, compute will be requested through CMU Public Cloud Services with a budget cap of $100, and cloud model API usage will be limited accordingly.</w:t>
+        <w:t xml:space="preserve">Cloud model API usage and sandbox compute costs will be covered by the Client [to be confirmed with the Client before signing]: the Client will provide cloud model API credits up to $[X] together with the sandbox compute described above, and the student project team will keep usage within that limit.</w:t>
       </w:r>
     </w:p>
     <w:p>
@@ -2475,7 +2475,7 @@
           <w:color w:val="FF0000"/>
           <w:rtl w:val="0"/>
         </w:rPr>
-        <w:t xml:space="preserve">in a cloud-based sandbox environment provided by the Client or by CMU Computing Services, configured to simulate an on-premises enterprise deployment; student laptops are used for development only. All work uses</w:t>
+        <w:t xml:space="preserve">in a cloud-based sandbox environment provided by the Client, configured to simulate an on-premises enterprise deployment; student laptops are used for development only. All work uses</w:t>
       </w:r>
       <w:r>
         <w:rPr>

</xml_diff>